<commit_message>
docs: align audit and career documentation
</commit_message>
<xml_diff>
--- a/docs/career/Ednaldo_Aquino_Curriculo_ATS.docx
+++ b/docs/career/Ednaldo_Aquino_Curriculo_ATS.docx
@@ -80,27 +80,27 @@
     </w:p>
     <w:p>
       <w:r>
-        <w:t xml:space="preserve">para gestao de catalogo, frete, checkout via WhatsApp e historico de vendas,</w:t>
-      </w:r>
-    </w:p>
-    <w:p>
-      <w:r>
-        <w:t xml:space="preserve">aplicando boas praticas de Clean Code, documentacao tecnica, validacao de dados</w:t>
-      </w:r>
-    </w:p>
-    <w:p>
-      <w:r>
-        <w:t xml:space="preserve">e qualidade com testes. Busco primeira oportunidade formal em desenvolvimento</w:t>
-      </w:r>
-    </w:p>
-    <w:p>
-      <w:r>
-        <w:t xml:space="preserve">para atuar com backend, frontend ou full stack em times que valorizem codigo</w:t>
-      </w:r>
-    </w:p>
-    <w:p>
-      <w:r>
-        <w:t xml:space="preserve">claro, testavel e bem documentado.</w:t>
+        <w:t xml:space="preserve">multi-loja para gestao de catalogo, frete, PDV, estoque auditado, perfil</w:t>
+      </w:r>
+    </w:p>
+    <w:p>
+      <w:r>
+        <w:t xml:space="preserve">de cliente, checkout via WhatsApp e historico de vendas, aplicando Clean</w:t>
+      </w:r>
+    </w:p>
+    <w:p>
+      <w:r>
+        <w:t xml:space="preserve">Code, documentacao tecnica, validacao de dados, UX mobile e qualidade com</w:t>
+      </w:r>
+    </w:p>
+    <w:p>
+      <w:r>
+        <w:t xml:space="preserve">testes. Busco primeira vaga dedicada como desenvolvedor junior ou full stack</w:t>
+      </w:r>
+    </w:p>
+    <w:p>
+      <w:r>
+        <w:t xml:space="preserve">em times que valorizem codigo claro, testavel e bem documentado.</w:t>
       </w:r>
     </w:p>
     <w:p>
@@ -247,38 +247,38 @@
     </w:p>
     <w:p>
       <w:r>
-        <w:t xml:space="preserve">Aplicacao full-stack para pequenos negocios controlarem catalogo, frete por</w:t>
-      </w:r>
-    </w:p>
-    <w:p>
-      <w:r>
-        <w:t xml:space="preserve">regiao, pedidos e checkout via WhatsApp.</w:t>
-      </w:r>
-    </w:p>
-    <w:p>
-      <w:r>
-        <w:t xml:space="preserve"/>
-      </w:r>
-    </w:p>
-    <w:p>
-      <w:pPr>
-        <w:numPr>
-          <w:ilvl w:val="0"/>
-          <w:numId w:val="1"/>
-        </w:numPr>
-      </w:pPr>
-      <w:r>
-        <w:t xml:space="preserve">Desenvolvi o backend com Django REST Framework para centralizar regras de</w:t>
-      </w:r>
-    </w:p>
-    <w:p>
-      <w:r>
-        <w:t xml:space="preserve">  negocio de produtos, categorias, estoque, frete, checkout e historico de</w:t>
-      </w:r>
-    </w:p>
-    <w:p>
-      <w:r>
-        <w:t xml:space="preserve">  vendas, reduzindo dependencia de controles manuais em planilhas ou mensagens.</w:t>
+        <w:t xml:space="preserve">Aplicacao full-stack multi-loja para pequenos negocios controlarem catalogo,</w:t>
+      </w:r>
+    </w:p>
+    <w:p>
+      <w:r>
+        <w:t xml:space="preserve">frete por regiao, PDV, estoque, pedidos e checkout via WhatsApp.</w:t>
+      </w:r>
+    </w:p>
+    <w:p>
+      <w:r>
+        <w:t xml:space="preserve"/>
+      </w:r>
+    </w:p>
+    <w:p>
+      <w:pPr>
+        <w:numPr>
+          <w:ilvl w:val="0"/>
+          <w:numId w:val="1"/>
+        </w:numPr>
+      </w:pPr>
+      <w:r>
+        <w:t xml:space="preserve">Desenvolvi backend em Django REST Framework para centralizar regras de</w:t>
+      </w:r>
+    </w:p>
+    <w:p>
+      <w:r>
+        <w:t xml:space="preserve">  negocio de lojas, produtos, categorias, estoque, frete, checkout e vendas,</w:t>
+      </w:r>
+    </w:p>
+    <w:p>
+      <w:r>
+        <w:t xml:space="preserve">  reduzindo dependencia de controles manuais em planilhas ou mensagens.</w:t>
       </w:r>
     </w:p>
     <w:p>
@@ -315,7 +315,7 @@
     </w:p>
     <w:p>
       <w:r>
-        <w:t xml:space="preserve">  via WhatsApp e vendas, mantendo o backend como autoridade para preco, estoque,</w:t>
+        <w:t xml:space="preserve">  via WhatsApp e vendas, mantendo backend como autoridade para preco, estoque,</w:t>
       </w:r>
     </w:p>
     <w:p>
@@ -331,102 +331,102 @@
         </w:numPr>
       </w:pPr>
       <w:r>
-        <w:t xml:space="preserve">Construi o frontend com Vue.js 3 e TypeScript, separando services,</w:t>
-      </w:r>
-    </w:p>
-    <w:p>
-      <w:r>
-        <w:t xml:space="preserve">  composables, types e schemas para manter o fluxo de dados previsivel e facil</w:t>
-      </w:r>
-    </w:p>
-    <w:p>
-      <w:r>
-        <w:t xml:space="preserve">  de manter.</w:t>
-      </w:r>
-    </w:p>
-    <w:p>
-      <w:pPr>
-        <w:numPr>
-          <w:ilvl w:val="0"/>
-          <w:numId w:val="1"/>
-        </w:numPr>
-      </w:pPr>
-      <w:r>
-        <w:t xml:space="preserve">Apliquei validacao com Zod no frontend e serializers no backend para prevenir</w:t>
-      </w:r>
-    </w:p>
-    <w:p>
-      <w:r>
-        <w:t xml:space="preserve">  payloads invalidos antes de gravar ou processar dados sensiveis.</w:t>
-      </w:r>
-    </w:p>
-    <w:p>
-      <w:pPr>
-        <w:numPr>
-          <w:ilvl w:val="0"/>
-          <w:numId w:val="1"/>
-        </w:numPr>
-      </w:pPr>
-      <w:r>
-        <w:t xml:space="preserve">Implementei upload de imagens com capa e galeria limitada, preservando ordem</w:t>
-      </w:r>
-    </w:p>
-    <w:p>
-      <w:r>
-        <w:t xml:space="preserve">  visual e URLs absolutas para renderizacao correta no catalogo e dashboard.</w:t>
-      </w:r>
-    </w:p>
-    <w:p>
-      <w:pPr>
-        <w:numPr>
-          <w:ilvl w:val="0"/>
-          <w:numId w:val="1"/>
-        </w:numPr>
-      </w:pPr>
-      <w:r>
-        <w:t xml:space="preserve">Criei cobertura de testes e validacoes com Pytest, Vitest, Ruff, ESLint,</w:t>
-      </w:r>
-    </w:p>
-    <w:p>
-      <w:r>
-        <w:t xml:space="preserve">  typecheck e build, com 86 testes backend e 37 testes unitarios frontend</w:t>
-      </w:r>
-    </w:p>
-    <w:p>
-      <w:r>
-        <w:t xml:space="preserve">  executados localmente.</w:t>
-      </w:r>
-    </w:p>
-    <w:p>
-      <w:pPr>
-        <w:numPr>
-          <w:ilvl w:val="0"/>
-          <w:numId w:val="1"/>
-        </w:numPr>
-      </w:pPr>
-      <w:r>
-        <w:t xml:space="preserve">Configurei specs Cypress e comandos reutilizaveis de login via API para</w:t>
-      </w:r>
-    </w:p>
-    <w:p>
-      <w:r>
-        <w:t xml:space="preserve">  validar fluxos de dashboard e upload de produto em ambiente E2E.</w:t>
-      </w:r>
-    </w:p>
-    <w:p>
-      <w:pPr>
-        <w:numPr>
-          <w:ilvl w:val="0"/>
-          <w:numId w:val="1"/>
-        </w:numPr>
-      </w:pPr>
-      <w:r>
-        <w:t xml:space="preserve">Documentei arquitetura, setup, contratos de API e decisoes tecnicas em</w:t>
-      </w:r>
-    </w:p>
-    <w:p>
-      <w:r>
-        <w:t xml:space="preserve">  Markdown, facilitando manutencao, revisao e onboarding.</w:t>
+        <w:t xml:space="preserve">Evolui a base multi-loja com Store, StoreMembership, seletor de loja,</w:t>
+      </w:r>
+    </w:p>
+    <w:p>
+      <w:r>
+        <w:t xml:space="preserve">  vitrine publica por storeSlug e queries de negocio escopadas por loja.</w:t>
+      </w:r>
+    </w:p>
+    <w:p>
+      <w:r>
+        <w:t xml:space="preserve">Implementei PDV por QR/codigo publico, recibo, envio por email e baixa de</w:t>
+      </w:r>
+    </w:p>
+    <w:p>
+      <w:pPr>
+        <w:numPr>
+          <w:ilvl w:val="0"/>
+          <w:numId w:val="1"/>
+        </w:numPr>
+      </w:pPr>
+      <w:r>
+        <w:t xml:space="preserve">  estoque auditada para vendas presenciais e online.</w:t>
+      </w:r>
+    </w:p>
+    <w:p>
+      <w:r>
+        <w:t xml:space="preserve">Criei fluxo de perfil de cliente por loja, login da vitrine e recuperacao</w:t>
+      </w:r>
+    </w:p>
+    <w:p>
+      <w:pPr>
+        <w:numPr>
+          <w:ilvl w:val="0"/>
+          <w:numId w:val="1"/>
+        </w:numPr>
+      </w:pPr>
+      <w:r>
+        <w:t xml:space="preserve">  de senha no contexto do cliente, separado do painel administrativo.</w:t>
+      </w:r>
+    </w:p>
+    <w:p>
+      <w:r>
+        <w:t xml:space="preserve">Construi frontend em Vue.js 3 e TypeScript com services, composables, types</w:t>
+      </w:r>
+    </w:p>
+    <w:p>
+      <w:pPr>
+        <w:numPr>
+          <w:ilvl w:val="0"/>
+          <w:numId w:val="1"/>
+        </w:numPr>
+      </w:pPr>
+      <w:r>
+        <w:t xml:space="preserve">  e schemas para manter o fluxo de dados previsivel e facil de manter.</w:t>
+      </w:r>
+    </w:p>
+    <w:p>
+      <w:r>
+        <w:t xml:space="preserve">Realizei refinamento visual do carrinho em telas pequenas, corrigindo</w:t>
+      </w:r>
+    </w:p>
+    <w:p>
+      <w:r>
+        <w:t xml:space="preserve">  overflow em 320px, toast, footer compacto e mensagens em portugues.</w:t>
+      </w:r>
+    </w:p>
+    <w:p>
+      <w:pPr>
+        <w:numPr>
+          <w:ilvl w:val="0"/>
+          <w:numId w:val="1"/>
+        </w:numPr>
+      </w:pPr>
+      <w:r>
+        <w:t xml:space="preserve">Mantenho regressao com Pytest, Vitest, Cypress, Ruff, ESLint, typecheck,</w:t>
+      </w:r>
+    </w:p>
+    <w:p>
+      <w:r>
+        <w:t xml:space="preserve">  build e hooks de pre-commit em backend, frontend e fluxos E2E.</w:t>
+      </w:r>
+    </w:p>
+    <w:p>
+      <w:pPr>
+        <w:numPr>
+          <w:ilvl w:val="0"/>
+          <w:numId w:val="1"/>
+        </w:numPr>
+      </w:pPr>
+      <w:r>
+        <w:t xml:space="preserve">Documentei arquitetura, setup, contratos de API, checklist de producao,</w:t>
+      </w:r>
+    </w:p>
+    <w:p>
+      <w:r>
+        <w:t xml:space="preserve">  auditorias e registros de validacao para manutencao e onboarding.</w:t>
       </w:r>
     </w:p>
     <w:p>
@@ -441,7 +441,7 @@
     </w:p>
     <w:p>
       <w:r>
-        <w:t xml:space="preserve">Vite, Axios, Zod, SQLite, Pytest, Vitest, Cypress, Ruff, ESLint, Git.</w:t>
+        <w:t xml:space="preserve">Vite, Axios, Zod, SQLite, PostgreSQL, Redis, Docker, Pytest, Vitest, Cypress, Ruff, ESLint, Git.</w:t>
       </w:r>
     </w:p>
     <w:p>
@@ -649,12 +649,12 @@
         </w:numPr>
       </w:pPr>
       <w:r>
-        <w:t xml:space="preserve">Disponivel para oportunidades Junior, Estagio ou Trainee em Desenvolvimento</w:t>
-      </w:r>
-    </w:p>
-    <w:p>
-      <w:r>
-        <w:t xml:space="preserve">  Backend, Frontend ou Full Stack.</w:t>
+        <w:t xml:space="preserve">Disponivel para primeira vaga dedicada como Desenvolvedor Junior, Estagio ou</w:t>
+      </w:r>
+    </w:p>
+    <w:p>
+      <w:r>
+        <w:t xml:space="preserve">  Trainee em Backend, Frontend ou Full Stack.</w:t>
       </w:r>
     </w:p>
     <w:p>

</xml_diff>